<commit_message>
tried a lot of stuff
</commit_message>
<xml_diff>
--- a/backend/pdfs/jinja_pdfs/Jinja0.docx
+++ b/backend/pdfs/jinja_pdfs/Jinja0.docx
@@ -831,231 +831,9 @@
           <w:kern w:val="0"/>
           <w:lang w:val="en-UG" w:eastAsia="en-GB"/>
         </w:rPr>
-        <w:pict w14:anchorId="732A751E">
+        <w:pict w14:anchorId="71FBA8A6">
           <v:rect id="_x0000_i1025" alt="" style="width:451.3pt;height:.05pt;mso-width-percent:0;mso-height-percent:0;mso-width-percent:0;mso-height-percent:0" o:hralign="center" o:hrstd="t" o:hrnoshade="t" o:hr="t" fillcolor="gray" stroked="f"/>
         </w:pict>
-      </w:r>
-    </w:p>
-    <w:p>
-      <w:pPr>
-        <w:spacing w:after="120" w:line="240" w:lineRule="auto"/>
-        <w:outlineLvl w:val="2"/>
-        <w:rPr>
-          <w:rFonts w:ascii="Arial" w:eastAsia="Times New Roman" w:hAnsi="Arial" w:cs="Times New Roman"/>
-          <w:b/>
-          <w:bCs/>
-          <w:color w:val="1F1F1F"/>
-          <w:kern w:val="0"/>
-          <w:sz w:val="27"/>
-          <w:szCs w:val="27"/>
-          <w:lang w:val="en-UG" w:eastAsia="en-GB"/>
-          <w14:ligatures w14:val="none"/>
-        </w:rPr>
-      </w:pPr>
-      <w:r>
-        <w:rPr>
-          <w:rFonts w:ascii="Arial" w:eastAsia="Times New Roman" w:hAnsi="Arial" w:cs="Times New Roman"/>
-          <w:b/>
-          <w:bCs/>
-          <w:color w:val="1F1F1F"/>
-          <w:kern w:val="0"/>
-          <w:sz w:val="27"/>
-          <w:szCs w:val="27"/>
-          <w:lang w:val="en-UG" w:eastAsia="en-GB"/>
-          <w14:ligatures w14:val="none"/>
-        </w:rPr>
-        <w:t>How to Save This as a PDF:</w:t>
-      </w:r>
-    </w:p>
-    <w:p>
-      <w:pPr>
-        <w:numPr>
-          <w:ilvl w:val="0"/>
-          <w:numId w:val="2"/>
-        </w:numPr>
-        <w:spacing w:after="0" w:line="240" w:lineRule="auto"/>
-        <w:rPr>
-          <w:rFonts w:ascii="Arial" w:eastAsia="Times New Roman" w:hAnsi="Arial" w:cs="Times New Roman"/>
-          <w:color w:val="1F1F1F"/>
-          <w:kern w:val="0"/>
-          <w:lang w:val="en-UG" w:eastAsia="en-GB"/>
-          <w14:ligatures w14:val="none"/>
-        </w:rPr>
-      </w:pPr>
-      <w:r>
-        <w:rPr>
-          <w:rFonts w:ascii="Arial" w:eastAsia="Times New Roman" w:hAnsi="Arial" w:cs="Times New Roman"/>
-          <w:b/>
-          <w:bCs/>
-          <w:color w:val="1F1F1F"/>
-          <w:kern w:val="0"/>
-          <w:bdr w:val="none" w:sz="0" w:space="0" w:color="auto" w:frame="1"/>
-          <w:lang w:val="en-UG" w:eastAsia="en-GB"/>
-          <w14:ligatures w14:val="none"/>
-        </w:rPr>
-        <w:t>Select/Highlight</w:t>
-      </w:r>
-      <w:r>
-        <w:rPr>
-          <w:rFonts w:ascii="Arial" w:eastAsia="Times New Roman" w:hAnsi="Arial" w:cs="Times New Roman"/>
-          <w:color w:val="1F1F1F"/>
-          <w:kern w:val="0"/>
-          <w:lang w:val="en-UG" w:eastAsia="en-GB"/>
-          <w14:ligatures w14:val="none"/>
-        </w:rPr>
-        <w:t xml:space="preserve"> the text from the header to the conclusion.</w:t>
-      </w:r>
-    </w:p>
-    <w:p>
-      <w:pPr>
-        <w:numPr>
-          <w:ilvl w:val="0"/>
-          <w:numId w:val="2"/>
-        </w:numPr>
-        <w:spacing w:after="0" w:line="240" w:lineRule="auto"/>
-        <w:rPr>
-          <w:rFonts w:ascii="Arial" w:eastAsia="Times New Roman" w:hAnsi="Arial" w:cs="Times New Roman"/>
-          <w:color w:val="1F1F1F"/>
-          <w:kern w:val="0"/>
-          <w:lang w:val="en-UG" w:eastAsia="en-GB"/>
-          <w14:ligatures w14:val="none"/>
-        </w:rPr>
-      </w:pPr>
-      <w:r>
-        <w:rPr>
-          <w:rFonts w:ascii="Arial" w:eastAsia="Times New Roman" w:hAnsi="Arial" w:cs="Times New Roman"/>
-          <w:b/>
-          <w:bCs/>
-          <w:color w:val="1F1F1F"/>
-          <w:kern w:val="0"/>
-          <w:bdr w:val="none" w:sz="0" w:space="0" w:color="auto" w:frame="1"/>
-          <w:lang w:val="en-UG" w:eastAsia="en-GB"/>
-          <w14:ligatures w14:val="none"/>
-        </w:rPr>
-        <w:t>Copy (Ctrl+C / Cmd+C)</w:t>
-      </w:r>
-      <w:r>
-        <w:rPr>
-          <w:rFonts w:ascii="Arial" w:eastAsia="Times New Roman" w:hAnsi="Arial" w:cs="Times New Roman"/>
-          <w:color w:val="1F1F1F"/>
-          <w:kern w:val="0"/>
-          <w:lang w:val="en-UG" w:eastAsia="en-GB"/>
-          <w14:ligatures w14:val="none"/>
-        </w:rPr>
-        <w:t xml:space="preserve"> the text.</w:t>
-      </w:r>
-    </w:p>
-    <w:p>
-      <w:pPr>
-        <w:numPr>
-          <w:ilvl w:val="0"/>
-          <w:numId w:val="2"/>
-        </w:numPr>
-        <w:spacing w:after="0" w:line="240" w:lineRule="auto"/>
-        <w:rPr>
-          <w:rFonts w:ascii="Arial" w:eastAsia="Times New Roman" w:hAnsi="Arial" w:cs="Times New Roman"/>
-          <w:color w:val="1F1F1F"/>
-          <w:kern w:val="0"/>
-          <w:lang w:val="en-UG" w:eastAsia="en-GB"/>
-          <w14:ligatures w14:val="none"/>
-        </w:rPr>
-      </w:pPr>
-      <w:r>
-        <w:rPr>
-          <w:rFonts w:ascii="Arial" w:eastAsia="Times New Roman" w:hAnsi="Arial" w:cs="Times New Roman"/>
-          <w:b/>
-          <w:bCs/>
-          <w:color w:val="1F1F1F"/>
-          <w:kern w:val="0"/>
-          <w:bdr w:val="none" w:sz="0" w:space="0" w:color="auto" w:frame="1"/>
-          <w:lang w:val="en-UG" w:eastAsia="en-GB"/>
-          <w14:ligatures w14:val="none"/>
-        </w:rPr>
-        <w:t>Paste (Ctrl+V / Cmd+V)</w:t>
-      </w:r>
-      <w:r>
-        <w:rPr>
-          <w:rFonts w:ascii="Arial" w:eastAsia="Times New Roman" w:hAnsi="Arial" w:cs="Times New Roman"/>
-          <w:color w:val="1F1F1F"/>
-          <w:kern w:val="0"/>
-          <w:lang w:val="en-UG" w:eastAsia="en-GB"/>
-          <w14:ligatures w14:val="none"/>
-        </w:rPr>
-        <w:t xml:space="preserve"> into a program like Google Docs or Microsoft Word.</w:t>
-      </w:r>
-    </w:p>
-    <w:p>
-      <w:pPr>
-        <w:numPr>
-          <w:ilvl w:val="0"/>
-          <w:numId w:val="2"/>
-        </w:numPr>
-        <w:spacing w:after="0" w:line="240" w:lineRule="auto"/>
-        <w:rPr>
-          <w:rFonts w:ascii="Arial" w:eastAsia="Times New Roman" w:hAnsi="Arial" w:cs="Times New Roman"/>
-          <w:color w:val="1F1F1F"/>
-          <w:kern w:val="0"/>
-          <w:lang w:val="en-UG" w:eastAsia="en-GB"/>
-          <w14:ligatures w14:val="none"/>
-        </w:rPr>
-      </w:pPr>
-      <w:r>
-        <w:rPr>
-          <w:rFonts w:ascii="Arial" w:eastAsia="Times New Roman" w:hAnsi="Arial" w:cs="Times New Roman"/>
-          <w:color w:val="1F1F1F"/>
-          <w:kern w:val="0"/>
-          <w:lang w:val="en-UG" w:eastAsia="en-GB"/>
-          <w14:ligatures w14:val="none"/>
-        </w:rPr>
-        <w:t xml:space="preserve">Go to </w:t>
-      </w:r>
-      <w:r>
-        <w:rPr>
-          <w:rFonts w:ascii="Arial" w:eastAsia="Times New Roman" w:hAnsi="Arial" w:cs="Times New Roman"/>
-          <w:b/>
-          <w:bCs/>
-          <w:color w:val="1F1F1F"/>
-          <w:kern w:val="0"/>
-          <w:bdr w:val="none" w:sz="0" w:space="0" w:color="auto" w:frame="1"/>
-          <w:lang w:val="en-UG" w:eastAsia="en-GB"/>
-          <w14:ligatures w14:val="none"/>
-        </w:rPr>
-        <w:t>File &gt; Download &gt; PDF Document (.pdf)</w:t>
-      </w:r>
-      <w:r>
-        <w:rPr>
-          <w:rFonts w:ascii="Arial" w:eastAsia="Times New Roman" w:hAnsi="Arial" w:cs="Times New Roman"/>
-          <w:color w:val="1F1F1F"/>
-          <w:kern w:val="0"/>
-          <w:lang w:val="en-UG" w:eastAsia="en-GB"/>
-          <w14:ligatures w14:val="none"/>
-        </w:rPr>
-        <w:t>.</w:t>
-      </w:r>
-    </w:p>
-    <w:p>
-      <w:pPr>
-        <w:spacing w:after="0" w:line="240" w:lineRule="auto"/>
-        <w:rPr>
-          <w:rFonts w:ascii="Arial" w:eastAsia="Times New Roman" w:hAnsi="Arial" w:cs="Times New Roman"/>
-          <w:color w:val="1F1F1F"/>
-          <w:kern w:val="0"/>
-          <w:lang w:val="en-UG" w:eastAsia="en-GB"/>
-          <w14:ligatures w14:val="none"/>
-        </w:rPr>
-      </w:pPr>
-      <w:r>
-        <w:rPr>
-          <w:rFonts w:ascii="Arial" w:eastAsia="Times New Roman" w:hAnsi="Arial" w:cs="Times New Roman"/>
-          <w:b/>
-          <w:bCs/>
-          <w:color w:val="1F1F1F"/>
-          <w:kern w:val="0"/>
-          <w:bdr w:val="none" w:sz="0" w:space="0" w:color="auto" w:frame="1"/>
-          <w:lang w:val="en-UG" w:eastAsia="en-GB"/>
-          <w14:ligatures w14:val="none"/>
-        </w:rPr>
-        <w:t>Would you like me to create a "Table of Contents" or a "Quick Travel Tips" page to go along with these essays for your final document?</w:t>
       </w:r>
     </w:p>
     <w:p/>

</xml_diff>